<commit_message>
Reframe as scenarios (nothing decided); add Cost-of-2nd-Source matrix
- Model: soften 'decided' labels to scenario language; add 'Cost of 2nd Source'
  tab — annual redundancy premium across allocation x 2nd-source price x SNP
  surcharge (incl. SNP-raises-price cases)
- Report & slides: replace decided-plan framing with scenario cost analysis;
  add the cost matrix and the 'SNP increase hits retained volume' insight

Co-Authored-By: Claude Opus 4.8 <noreply@anthropic.com>
Claude-Session: https://claude.ai/code/session_01LkE2ZRYs3PLyj8XHTsU3i4
</commit_message>
<xml_diff>
--- a/PVA second supplier initiative/PVA_Second_Source_Report.docx
+++ b/PVA second supplier initiative/PVA_Second_Source_Report.docx
@@ -40,7 +40,7 @@
           <w:color w:val="808080"/>
           <w:sz w:val="20"/>
         </w:rPr>
-        <w:t>Prepared by: Oscar Penny  |  Date: 2026-06-27  |  Status: In Progress — front-runner identified</w:t>
+        <w:t>Prepared by: Oscar Penny  |  Date: 2026-06-27  |  Status: In Progress — candidates engaged; nothing decided</w:t>
       </w:r>
     </w:p>
     <w:p>
@@ -65,7 +65,7 @@
           <w:b w:val="0"/>
           <w:i w:val="0"/>
         </w:rPr>
-        <w:t>We are qualifying a second source for our liquid PVA solution to remove a single-source dependency on SNP. After screening a US-only candidate field, the binding constraint proved to be process capability — the product requires a 90–95 °C dissolution cook that most candidates cannot achieve. Two suppliers clear that bar and are actively engaged: CJB Applied Technologies (front-runner, hard gate confirmed in interview) and APV Engineered Coatings (strong second, competitively engaged and seeking pricing). The plan is to award the second source roughly one 55-gallon drum per week (~35% of total volume), priced per drum as a recurring rotation, at an estimated redundancy premium of ~$8,800/yr.</w:t>
+        <w:t>We are qualifying a second source for our liquid PVA solution to remove a single-source dependency on SNP. After screening a US-only candidate field, the binding constraint proved to be process capability — the product requires a 90–95 °C dissolution cook that most candidates cannot achieve. Two suppliers clear that bar and are actively engaged: CJB Applied Technologies (leading candidate, hard gate confirmed in interview) and APV Engineered Coatings (engaged and seeking pricing). No allocation or award is decided. This report quantifies the cost of keeping a second source across scenarios — different volume splits, second-source price premiums, and the case where SNP raises its price on the reduced volume — so the decision can be made as quotes arrive.</w:t>
       </w:r>
     </w:p>
     <w:tbl>
@@ -81,7 +81,7 @@
       <w:tr>
         <w:tc>
           <w:tcPr>
-            <w:tcW w:type="dxa" w:w="3168"/>
+            <w:tcW w:type="dxa" w:w="3744"/>
             <w:shd w:val="clear" w:fill="1F4E78"/>
           </w:tcPr>
           <w:p>
@@ -97,7 +97,7 @@
         </w:tc>
         <w:tc>
           <w:tcPr>
-            <w:tcW w:type="dxa" w:w="6624"/>
+            <w:tcW w:type="dxa" w:w="6336"/>
             <w:shd w:val="clear" w:fill="1F4E78"/>
           </w:tcPr>
           <w:p>
@@ -115,7 +115,7 @@
       <w:tr>
         <w:tc>
           <w:tcPr>
-            <w:tcW w:type="dxa" w:w="3168"/>
+            <w:tcW w:type="dxa" w:w="3744"/>
           </w:tcPr>
           <w:p>
             <w:r>
@@ -128,7 +128,7 @@
         </w:tc>
         <w:tc>
           <w:tcPr>
-            <w:tcW w:type="dxa" w:w="6624"/>
+            <w:tcW w:type="dxa" w:w="6336"/>
           </w:tcPr>
           <w:p>
             <w:r>
@@ -143,7 +143,7 @@
       <w:tr>
         <w:tc>
           <w:tcPr>
-            <w:tcW w:type="dxa" w:w="3168"/>
+            <w:tcW w:type="dxa" w:w="3744"/>
           </w:tcPr>
           <w:p>
             <w:r>
@@ -156,7 +156,7 @@
         </w:tc>
         <w:tc>
           <w:tcPr>
-            <w:tcW w:type="dxa" w:w="6624"/>
+            <w:tcW w:type="dxa" w:w="6336"/>
           </w:tcPr>
           <w:p>
             <w:r>
@@ -171,7 +171,7 @@
       <w:tr>
         <w:tc>
           <w:tcPr>
-            <w:tcW w:type="dxa" w:w="3168"/>
+            <w:tcW w:type="dxa" w:w="3744"/>
           </w:tcPr>
           <w:p>
             <w:r>
@@ -184,7 +184,7 @@
         </w:tc>
         <w:tc>
           <w:tcPr>
-            <w:tcW w:type="dxa" w:w="6624"/>
+            <w:tcW w:type="dxa" w:w="6336"/>
           </w:tcPr>
           <w:p>
             <w:r>
@@ -199,27 +199,27 @@
       <w:tr>
         <w:tc>
           <w:tcPr>
-            <w:tcW w:type="dxa" w:w="3168"/>
+            <w:tcW w:type="dxa" w:w="3744"/>
           </w:tcPr>
           <w:p>
             <w:r>
               <w:rPr>
                 <w:sz w:val="19"/>
               </w:rPr>
-              <w:t>Decided 2nd-source allocation</w:t>
+              <w:t>Cost of a 2nd source (SNP holds price)</w:t>
             </w:r>
           </w:p>
         </w:tc>
         <w:tc>
           <w:tcPr>
-            <w:tcW w:type="dxa" w:w="6624"/>
+            <w:tcW w:type="dxa" w:w="6336"/>
           </w:tcPr>
           <w:p>
             <w:r>
               <w:rPr>
                 <w:sz w:val="19"/>
               </w:rPr>
-              <w:t>~1 drum/week = 52 drums/yr (~35% of volume)</w:t>
+              <w:t>~$5k–$13k/yr depending on split &amp; price premium (≈$0 at parity)</w:t>
             </w:r>
           </w:p>
         </w:tc>
@@ -227,27 +227,27 @@
       <w:tr>
         <w:tc>
           <w:tcPr>
-            <w:tcW w:type="dxa" w:w="3168"/>
+            <w:tcW w:type="dxa" w:w="3744"/>
           </w:tcPr>
           <w:p>
             <w:r>
               <w:rPr>
                 <w:sz w:val="19"/>
               </w:rPr>
-              <w:t>Est. redundancy premium</w:t>
+              <w:t>If SNP also raises its price</w:t>
             </w:r>
           </w:p>
         </w:tc>
         <w:tc>
           <w:tcPr>
-            <w:tcW w:type="dxa" w:w="6624"/>
+            <w:tcW w:type="dxa" w:w="6336"/>
           </w:tcPr>
           <w:p>
             <w:r>
               <w:rPr>
                 <w:sz w:val="19"/>
               </w:rPr>
-              <w:t>~$8,800/yr (+17%) at a +50% small-batch price assumption</w:t>
+              <w:t>Cost can roughly double — up to ~$30k/yr worst case (see scenario matrix)</w:t>
             </w:r>
           </w:p>
         </w:tc>
@@ -255,7 +255,7 @@
       <w:tr>
         <w:tc>
           <w:tcPr>
-            <w:tcW w:type="dxa" w:w="3168"/>
+            <w:tcW w:type="dxa" w:w="3744"/>
           </w:tcPr>
           <w:p>
             <w:r>
@@ -268,7 +268,7 @@
         </w:tc>
         <w:tc>
           <w:tcPr>
-            <w:tcW w:type="dxa" w:w="6624"/>
+            <w:tcW w:type="dxa" w:w="6336"/>
           </w:tcPr>
           <w:p>
             <w:r>
@@ -283,27 +283,27 @@
       <w:tr>
         <w:tc>
           <w:tcPr>
-            <w:tcW w:type="dxa" w:w="3168"/>
+            <w:tcW w:type="dxa" w:w="3744"/>
           </w:tcPr>
           <w:p>
             <w:r>
               <w:rPr>
                 <w:sz w:val="19"/>
               </w:rPr>
-              <w:t>Front-runner</w:t>
+              <w:t>Engaged candidates</w:t>
             </w:r>
           </w:p>
         </w:tc>
         <w:tc>
           <w:tcPr>
-            <w:tcW w:type="dxa" w:w="6624"/>
+            <w:tcW w:type="dxa" w:w="6336"/>
           </w:tcPr>
           <w:p>
             <w:r>
               <w:rPr>
                 <w:sz w:val="19"/>
               </w:rPr>
-              <w:t>CJB Applied Technologies (gate cleared 2026-06-26)</w:t>
+              <w:t>CJB (gate cleared 2026-06-26) and APV (pricing requested)</w:t>
             </w:r>
           </w:p>
         </w:tc>
@@ -311,27 +311,27 @@
       <w:tr>
         <w:tc>
           <w:tcPr>
-            <w:tcW w:type="dxa" w:w="3168"/>
+            <w:tcW w:type="dxa" w:w="3744"/>
           </w:tcPr>
           <w:p>
             <w:r>
               <w:rPr>
                 <w:sz w:val="19"/>
               </w:rPr>
-              <w:t>Competitive second</w:t>
+              <w:t>Status</w:t>
             </w:r>
           </w:p>
         </w:tc>
         <w:tc>
           <w:tcPr>
-            <w:tcW w:type="dxa" w:w="6624"/>
+            <w:tcW w:type="dxa" w:w="6336"/>
           </w:tcPr>
           <w:p>
             <w:r>
               <w:rPr>
                 <w:sz w:val="19"/>
               </w:rPr>
-              <w:t>APV Engineered Coatings (engaged, pricing requested)</w:t>
+              <w:t>No allocation decided — scenarios kept ready to update as quotes arrive</w:t>
             </w:r>
           </w:p>
         </w:tc>
@@ -465,7 +465,7 @@
           <w:color w:val="1F4E78"/>
           <w:sz w:val="30"/>
         </w:rPr>
-        <w:t>3. Demand &amp; Economics</w:t>
+        <w:t>3. The Cost of Keeping a Second Source</w:t>
       </w:r>
     </w:p>
     <w:p>
@@ -477,7 +477,7 @@
           <w:b w:val="0"/>
           <w:i w:val="0"/>
         </w:rPr>
-        <w:t>All figures below are in the working model (PVA_Second_Source_Pricing_Model.xlsx). Demand is confirmed at ~1,300 lb of finished liquid per week — the basis on which SNP bills ($/lb).</w:t>
+        <w:t>Demand is confirmed at ~1,300 lb of finished liquid per week (the basis on which SNP bills, $/lb). Against the all-SNP baseline, the cost of a second source is the 'redundancy premium' — the extra annual spend incurred to carry a backup. It is driven by three levers: how much volume goes to the second source, how much more the second source charges than SNP, and whether SNP raises its price on the reduced volume it retains.</w:t>
       </w:r>
     </w:p>
     <w:tbl>
@@ -493,7 +493,7 @@
       <w:tr>
         <w:tc>
           <w:tcPr>
-            <w:tcW w:type="dxa" w:w="3744"/>
+            <w:tcW w:type="dxa" w:w="2880"/>
             <w:shd w:val="clear" w:fill="1F4E78"/>
           </w:tcPr>
           <w:p>
@@ -509,7 +509,7 @@
         </w:tc>
         <w:tc>
           <w:tcPr>
-            <w:tcW w:type="dxa" w:w="6048"/>
+            <w:tcW w:type="dxa" w:w="6912"/>
             <w:shd w:val="clear" w:fill="1F4E78"/>
           </w:tcPr>
           <w:p>
@@ -527,7 +527,7 @@
       <w:tr>
         <w:tc>
           <w:tcPr>
-            <w:tcW w:type="dxa" w:w="3744"/>
+            <w:tcW w:type="dxa" w:w="2880"/>
           </w:tcPr>
           <w:p>
             <w:r>
@@ -540,7 +540,7 @@
         </w:tc>
         <w:tc>
           <w:tcPr>
-            <w:tcW w:type="dxa" w:w="6048"/>
+            <w:tcW w:type="dxa" w:w="6912"/>
           </w:tcPr>
           <w:p>
             <w:r>
@@ -555,7 +555,7 @@
       <w:tr>
         <w:tc>
           <w:tcPr>
-            <w:tcW w:type="dxa" w:w="3744"/>
+            <w:tcW w:type="dxa" w:w="2880"/>
           </w:tcPr>
           <w:p>
             <w:r>
@@ -568,7 +568,7 @@
         </w:tc>
         <w:tc>
           <w:tcPr>
-            <w:tcW w:type="dxa" w:w="6048"/>
+            <w:tcW w:type="dxa" w:w="6912"/>
           </w:tcPr>
           <w:p>
             <w:r>
@@ -583,7 +583,7 @@
       <w:tr>
         <w:tc>
           <w:tcPr>
-            <w:tcW w:type="dxa" w:w="3744"/>
+            <w:tcW w:type="dxa" w:w="2880"/>
           </w:tcPr>
           <w:p>
             <w:r>
@@ -596,14 +596,105 @@
         </w:tc>
         <w:tc>
           <w:tcPr>
-            <w:tcW w:type="dxa" w:w="6048"/>
+            <w:tcW w:type="dxa" w:w="6912"/>
           </w:tcPr>
           <w:p>
             <w:r>
               <w:rPr>
                 <w:sz w:val="19"/>
               </w:rPr>
-              <w:t>~$50,700 / yr</w:t>
+              <w:t>~$50,700 / yr — the reference point</w:t>
+            </w:r>
+          </w:p>
+        </w:tc>
+      </w:tr>
+    </w:tbl>
+    <w:p>
+      <w:pPr>
+        <w:spacing w:after="40"/>
+      </w:pPr>
+      <w:r>
+        <w:rPr>
+          <w:b/>
+          <w:i w:val="0"/>
+        </w:rPr>
+        <w:t>Scenario matrix — annual premium over the all-SNP baseline (selected scenarios; full interactive grid on the model's 'Cost of 2nd Source' tab):</w:t>
+      </w:r>
+    </w:p>
+    <w:tbl>
+      <w:tblPr>
+        <w:tblStyle w:val="TableGrid"/>
+        <w:tblW w:type="auto" w:w="0"/>
+        <w:tblLook w:firstColumn="1" w:firstRow="1" w:lastColumn="0" w:lastRow="0" w:noHBand="0" w:noVBand="1" w:val="04A0"/>
+      </w:tblPr>
+      <w:tblGrid>
+        <w:gridCol w:w="2160"/>
+        <w:gridCol w:w="2160"/>
+        <w:gridCol w:w="2160"/>
+        <w:gridCol w:w="2160"/>
+      </w:tblGrid>
+      <w:tr>
+        <w:tc>
+          <w:tcPr>
+            <w:tcW w:type="dxa" w:w="3024"/>
+            <w:shd w:val="clear" w:fill="1F4E78"/>
+          </w:tcPr>
+          <w:p>
+            <w:r>
+              <w:rPr>
+                <w:b/>
+                <w:color w:val="FFFFFF"/>
+                <w:sz w:val="19"/>
+              </w:rPr>
+              <w:t>Allocation to 2nd source</w:t>
+            </w:r>
+          </w:p>
+        </w:tc>
+        <w:tc>
+          <w:tcPr>
+            <w:tcW w:type="dxa" w:w="2304"/>
+            <w:shd w:val="clear" w:fill="1F4E78"/>
+          </w:tcPr>
+          <w:p>
+            <w:r>
+              <w:rPr>
+                <w:b/>
+                <w:color w:val="FFFFFF"/>
+                <w:sz w:val="19"/>
+              </w:rPr>
+              <w:t>2nd +50% / SNP holds</w:t>
+            </w:r>
+          </w:p>
+        </w:tc>
+        <w:tc>
+          <w:tcPr>
+            <w:tcW w:type="dxa" w:w="2304"/>
+            <w:shd w:val="clear" w:fill="1F4E78"/>
+          </w:tcPr>
+          <w:p>
+            <w:r>
+              <w:rPr>
+                <w:b/>
+                <w:color w:val="FFFFFF"/>
+                <w:sz w:val="19"/>
+              </w:rPr>
+              <w:t>2nd +50% / SNP +10%</w:t>
+            </w:r>
+          </w:p>
+        </w:tc>
+        <w:tc>
+          <w:tcPr>
+            <w:tcW w:type="dxa" w:w="2448"/>
+            <w:shd w:val="clear" w:fill="1F4E78"/>
+          </w:tcPr>
+          <w:p>
+            <w:r>
+              <w:rPr>
+                <w:b/>
+                <w:color w:val="FFFFFF"/>
+                <w:sz w:val="19"/>
+              </w:rPr>
+              <w:t>2nd +100% / SNP +20%</w:t>
             </w:r>
           </w:p>
         </w:tc>
@@ -611,27 +702,53 @@
       <w:tr>
         <w:tc>
           <w:tcPr>
-            <w:tcW w:type="dxa" w:w="3744"/>
+            <w:tcW w:type="dxa" w:w="3024"/>
           </w:tcPr>
           <w:p>
             <w:r>
               <w:rPr>
                 <w:sz w:val="19"/>
               </w:rPr>
-              <w:t>Decided plan — 2nd source</w:t>
+              <w:t>20%  (~0.6 drum/wk)</w:t>
             </w:r>
           </w:p>
         </w:tc>
         <w:tc>
           <w:tcPr>
-            <w:tcW w:type="dxa" w:w="6048"/>
+            <w:tcW w:type="dxa" w:w="2304"/>
           </w:tcPr>
           <w:p>
             <w:r>
               <w:rPr>
                 <w:sz w:val="19"/>
               </w:rPr>
-              <w:t>1 drum/wk = 52 drums/yr (34.6%) → ~$26,325/yr @ +50% est.</w:t>
+              <w:t>$5,070</w:t>
+            </w:r>
+          </w:p>
+        </w:tc>
+        <w:tc>
+          <w:tcPr>
+            <w:tcW w:type="dxa" w:w="2304"/>
+          </w:tcPr>
+          <w:p>
+            <w:r>
+              <w:rPr>
+                <w:sz w:val="19"/>
+              </w:rPr>
+              <w:t>$9,126</w:t>
+            </w:r>
+          </w:p>
+        </w:tc>
+        <w:tc>
+          <w:tcPr>
+            <w:tcW w:type="dxa" w:w="2448"/>
+          </w:tcPr>
+          <w:p>
+            <w:r>
+              <w:rPr>
+                <w:sz w:val="19"/>
+              </w:rPr>
+              <w:t>$18,252</w:t>
             </w:r>
           </w:p>
         </w:tc>
@@ -639,27 +756,53 @@
       <w:tr>
         <w:tc>
           <w:tcPr>
-            <w:tcW w:type="dxa" w:w="3744"/>
+            <w:tcW w:type="dxa" w:w="3024"/>
           </w:tcPr>
           <w:p>
             <w:r>
               <w:rPr>
                 <w:sz w:val="19"/>
               </w:rPr>
-              <w:t>Decided plan — SNP retained</w:t>
+              <w:t>35%  (~1 drum/wk)</w:t>
             </w:r>
           </w:p>
         </w:tc>
         <w:tc>
           <w:tcPr>
-            <w:tcW w:type="dxa" w:w="6048"/>
+            <w:tcW w:type="dxa" w:w="2304"/>
           </w:tcPr>
           <w:p>
             <w:r>
               <w:rPr>
                 <w:sz w:val="19"/>
               </w:rPr>
-              <w:t>~98 drums/yr → ~$33,150/yr</w:t>
+              <w:t>$8,872</w:t>
+            </w:r>
+          </w:p>
+        </w:tc>
+        <w:tc>
+          <w:tcPr>
+            <w:tcW w:type="dxa" w:w="2304"/>
+          </w:tcPr>
+          <w:p>
+            <w:r>
+              <w:rPr>
+                <w:sz w:val="19"/>
+              </w:rPr>
+              <w:t>$12,168</w:t>
+            </w:r>
+          </w:p>
+        </w:tc>
+        <w:tc>
+          <w:tcPr>
+            <w:tcW w:type="dxa" w:w="2448"/>
+          </w:tcPr>
+          <w:p>
+            <w:r>
+              <w:rPr>
+                <w:sz w:val="19"/>
+              </w:rPr>
+              <w:t>$24,336</w:t>
             </w:r>
           </w:p>
         </w:tc>
@@ -667,55 +810,53 @@
       <w:tr>
         <w:tc>
           <w:tcPr>
-            <w:tcW w:type="dxa" w:w="3744"/>
+            <w:tcW w:type="dxa" w:w="3024"/>
           </w:tcPr>
           <w:p>
             <w:r>
               <w:rPr>
                 <w:sz w:val="19"/>
               </w:rPr>
-              <w:t>Decided plan — total</w:t>
+              <w:t>50%  (~1.4 drum/wk)</w:t>
             </w:r>
           </w:p>
         </w:tc>
         <w:tc>
           <w:tcPr>
-            <w:tcW w:type="dxa" w:w="6048"/>
+            <w:tcW w:type="dxa" w:w="2304"/>
           </w:tcPr>
           <w:p>
             <w:r>
               <w:rPr>
                 <w:sz w:val="19"/>
               </w:rPr>
-              <w:t>~$59,475/yr</w:t>
+              <w:t>$12,675</w:t>
             </w:r>
           </w:p>
         </w:tc>
-      </w:tr>
-      <w:tr>
         <w:tc>
           <w:tcPr>
-            <w:tcW w:type="dxa" w:w="3744"/>
+            <w:tcW w:type="dxa" w:w="2304"/>
           </w:tcPr>
           <w:p>
             <w:r>
               <w:rPr>
                 <w:sz w:val="19"/>
               </w:rPr>
-              <w:t>Redundancy premium</w:t>
+              <w:t>$15,210</w:t>
             </w:r>
           </w:p>
         </w:tc>
         <w:tc>
           <w:tcPr>
-            <w:tcW w:type="dxa" w:w="6048"/>
+            <w:tcW w:type="dxa" w:w="2448"/>
           </w:tcPr>
           <w:p>
             <w:r>
               <w:rPr>
                 <w:sz w:val="19"/>
               </w:rPr>
-              <w:t>~$8,775/yr (+17.3%) vs all-SNP baseline</w:t>
+              <w:t>$30,420</w:t>
             </w:r>
           </w:p>
         </w:tc>
@@ -730,7 +871,7 @@
           <w:b w:val="0"/>
           <w:i w:val="0"/>
         </w:rPr>
-        <w:t>The premium is the cost of insurance against single-source failure. It scales with both the allocation and the eventual real price; the model's Price-Sensitivity and SNP Re-pricing tabs bound the range. A larger ~35% allocation (vs. the 20–25% originally considered) was chosen deliberately to keep the second source genuinely practiced given the short shelf life — the trade-off is greater volume pulled from SNP and therefore more exposure to an SNP re-price.</w:t>
+        <w:t>Two takeaways: (1) If SNP holds its price, redundancy is modest — roughly $5–13k/yr scaling with the split and the second-source premium, and ~$0 at price parity (the ideal but unlikely case). (2) If SNP re-prices the lost volume, the cost can roughly double — and because that surcharge lands on the larger retained volume, it is often a bigger driver than the second-source premium itself. Overall the cost of redundancy ranges ~$2.5k to ~$30k/yr across plausible scenarios. Nothing is decided; these scenarios update automatically as real quotes (and any SNP re-price) arrive.</w:t>
       </w:r>
     </w:p>
     <w:p>

</xml_diff>

<commit_message>
Apply hard cap: 2nd source gets no more than 1 drum/week
- Model: allocation labeled HARD CAP=1; cost matrix + split notes flag
  35% (~1 drum/wk) as the cap and 50% as reference-only
- Slides: cost table drops over-cap row; pricing slide swaps the 2-drum
  batch lever for steady-weekly-PO (capped at 1/wk); cadence slide
  reframed to weekly single-drum as recommended; summary range -> ~$0-24k
- Report: cost table + ranges updated for the cap

Co-Authored-By: Claude Opus 4.8 <noreply@anthropic.com>
Claude-Session: https://claude.ai/code/session_01LkE2ZRYs3PLyj8XHTsU3i4
</commit_message>
<xml_diff>
--- a/PVA second supplier initiative/PVA_Second_Source_Report.docx
+++ b/PVA second supplier initiative/PVA_Second_Source_Report.docx
@@ -206,6 +206,34 @@
               <w:rPr>
                 <w:sz w:val="19"/>
               </w:rPr>
+              <w:t>Volume cap to 2nd source</w:t>
+            </w:r>
+          </w:p>
+        </w:tc>
+        <w:tc>
+          <w:tcPr>
+            <w:tcW w:type="dxa" w:w="6336"/>
+          </w:tcPr>
+          <w:p>
+            <w:r>
+              <w:rPr>
+                <w:sz w:val="19"/>
+              </w:rPr>
+              <w:t>No more than 1 drum/week (~35% of volume, ~52 drums/yr)</w:t>
+            </w:r>
+          </w:p>
+        </w:tc>
+      </w:tr>
+      <w:tr>
+        <w:tc>
+          <w:tcPr>
+            <w:tcW w:type="dxa" w:w="3744"/>
+          </w:tcPr>
+          <w:p>
+            <w:r>
+              <w:rPr>
+                <w:sz w:val="19"/>
+              </w:rPr>
               <w:t>Cost of a 2nd source (SNP holds price)</w:t>
             </w:r>
           </w:p>
@@ -219,7 +247,7 @@
               <w:rPr>
                 <w:sz w:val="19"/>
               </w:rPr>
-              <w:t>~$5k–$13k/yr depending on split &amp; price premium (≈$0 at parity)</w:t>
+              <w:t>~$6–12k/yr at the proposed $1.00–1.25/lb band (≈$0 at parity)</w:t>
             </w:r>
           </w:p>
         </w:tc>
@@ -247,7 +275,7 @@
               <w:rPr>
                 <w:sz w:val="19"/>
               </w:rPr>
-              <w:t>Cost can roughly double — up to ~$30k/yr worst case (see scenario matrix)</w:t>
+              <w:t>Up to ~$24k/yr worst case at the cap (see scenario matrix)</w:t>
             </w:r>
           </w:p>
         </w:tc>
@@ -618,7 +646,7 @@
           <w:b/>
           <w:i w:val="0"/>
         </w:rPr>
-        <w:t>Scenario matrix — annual premium over the all-SNP baseline (selected scenarios; full interactive grid on the model's 'Cost of 2nd Source' tab):</w:t>
+        <w:t>This supplier is capped at no more than 1 drum/week (~35% of volume). Scenario matrix — annual premium over the all-SNP baseline (selected scenarios; full interactive grid on the model's 'Cost of 2nd Source' tab):</w:t>
       </w:r>
     </w:p>
     <w:tbl>
@@ -763,7 +791,7 @@
               <w:rPr>
                 <w:sz w:val="19"/>
               </w:rPr>
-              <w:t>35%  (~1 drum/wk)</w:t>
+              <w:t>35%  (~1 drum/wk — CAP)</w:t>
             </w:r>
           </w:p>
         </w:tc>
@@ -807,60 +835,6 @@
           </w:p>
         </w:tc>
       </w:tr>
-      <w:tr>
-        <w:tc>
-          <w:tcPr>
-            <w:tcW w:type="dxa" w:w="3024"/>
-          </w:tcPr>
-          <w:p>
-            <w:r>
-              <w:rPr>
-                <w:sz w:val="19"/>
-              </w:rPr>
-              <w:t>50%  (~1.4 drum/wk)</w:t>
-            </w:r>
-          </w:p>
-        </w:tc>
-        <w:tc>
-          <w:tcPr>
-            <w:tcW w:type="dxa" w:w="2304"/>
-          </w:tcPr>
-          <w:p>
-            <w:r>
-              <w:rPr>
-                <w:sz w:val="19"/>
-              </w:rPr>
-              <w:t>$12,675</w:t>
-            </w:r>
-          </w:p>
-        </w:tc>
-        <w:tc>
-          <w:tcPr>
-            <w:tcW w:type="dxa" w:w="2304"/>
-          </w:tcPr>
-          <w:p>
-            <w:r>
-              <w:rPr>
-                <w:sz w:val="19"/>
-              </w:rPr>
-              <w:t>$15,210</w:t>
-            </w:r>
-          </w:p>
-        </w:tc>
-        <w:tc>
-          <w:tcPr>
-            <w:tcW w:type="dxa" w:w="2448"/>
-          </w:tcPr>
-          <w:p>
-            <w:r>
-              <w:rPr>
-                <w:sz w:val="19"/>
-              </w:rPr>
-              <w:t>$30,420</w:t>
-            </w:r>
-          </w:p>
-        </w:tc>
-      </w:tr>
     </w:tbl>
     <w:p>
       <w:pPr>
@@ -871,7 +845,7 @@
           <w:b w:val="0"/>
           <w:i w:val="0"/>
         </w:rPr>
-        <w:t>Two takeaways: (1) If SNP holds its price, redundancy is modest — roughly $5–13k/yr scaling with the split and the second-source premium, and ~$0 at price parity (the ideal but unlikely case). (2) If SNP re-prices the lost volume, the cost can roughly double — and because that surcharge lands on the larger retained volume, it is often a bigger driver than the second-source premium itself. Overall the cost of redundancy ranges ~$2.5k to ~$30k/yr across plausible scenarios. Nothing is decided; these scenarios update automatically as real quotes (and any SNP re-price) arrive.</w:t>
+        <w:t>Two takeaways: (1) If SNP holds its price, redundancy is modest — at the proposed $1.00–1.25/lb band and the 1-drum/week cap, roughly $6–12k/yr, and ~$0 at price parity (the ideal but unlikely case). (2) If SNP re-prices the lost volume, the cost climbs — and because that surcharge lands on the larger retained volume, it is often a bigger driver than the second-source premium itself. At the cap, the cost of redundancy ranges ~$0 to ~$24k/yr (worst case = top price plus an SNP increase). Nothing is decided; these scenarios update automatically as real quotes (and any SNP re-price) arrive.</w:t>
       </w:r>
     </w:p>
     <w:p>

</xml_diff>